<commit_message>
Merge duplicate document renderers and add shared JSON-retry helper
Unify generate_tailored_cv.py's output schema with generate_profile_cv.py
(summary/experience/ordered_skills for both) so one render_document.py
can replace the two near-identical per-pipeline renderers. Add
json_utils.invoke_json() to replace the duplicated retry-loop code in
both generator classes, and give extraction the same retry robustness.

Co-Authored-By: Claude Sonnet 5 <noreply@anthropic.com>
Claude-Session: https://claude.ai/code/session_01HrzVYJebM5nFrL2Lrv6XbX
</commit_message>
<xml_diff>
--- a/Codebase/output/CV_Ananth_K_S_FinTech_Inc.docx
+++ b/Codebase/output/CV_Ananth_K_S_FinTech_Inc.docx
@@ -37,7 +37,7 @@
     </w:p>
     <w:p>
       <w:r>
-        <w:t>Seasoned Frontend Engineer with expertise in Kotlin, Android development, and various frontend frameworks. Skilled in designing scalable systems and leading architecture discussions.</w:t>
+        <w:t>Seasoned frontend engineer with expertise in Kotlin, Android, and various web technologies. Skilled in designing scalable systems, leading architecture discussions, and developing APIs. Passionate about mentoring and fostering the growth of frontend engineers.</w:t>
       </w:r>
     </w:p>
     <w:p>
@@ -59,7 +59,7 @@
     </w:p>
     <w:p>
       <w:r>
-        <w:t>Kotlin, Android</w:t>
+        <w:t>kotlin, android</w:t>
       </w:r>
     </w:p>
     <w:p>
@@ -98,7 +98,7 @@
         <w:pStyle w:val="ListBullet"/>
       </w:pPr>
       <w:r>
-        <w:t>Led architecture decisions for mobile applications, resulting in improved scalability and performance.</w:t>
+        <w:t>Led architecture discussions and designed scalable systems.</w:t>
       </w:r>
     </w:p>
     <w:p>
@@ -106,7 +106,15 @@
         <w:pStyle w:val="ListBullet"/>
       </w:pPr>
       <w:r>
-        <w:t>Developed APIs using Kotlin, enabling seamless integration with backend systems.</w:t>
+        <w:t>Developed APIs using relevant technologies.</w:t>
+      </w:r>
+    </w:p>
+    <w:p>
+      <w:pPr>
+        <w:pStyle w:val="ListBullet"/>
+      </w:pPr>
+      <w:r>
+        <w:t>Contributed to the mentorship and development of frontend engineers.</w:t>
       </w:r>
     </w:p>
     <w:p>

</xml_diff>